<commit_message>
Ae6: diagramas v2 que corrigen DEF-03 y DEF-04, y expediente final
</commit_message>
<xml_diff>
--- a/Ae6/Sanginez_Tony_Ae6_Expediente_VV.docx
+++ b/Ae6/Sanginez_Tony_Ae6_Expediente_VV.docx
@@ -847,7 +847,7 @@
                 <w:lang w:val="en-US"/>
               </w:rPr>
               <w:drawing>
-                <wp:inline distT="0" distB="0" distL="0" distR="0" wp14:anchorId="5AE9FC08" wp14:editId="49339140">
+                <wp:inline distT="0" distB="0" distL="0" distR="0" wp14:anchorId="5AE9FC08" wp14:editId="749EC01C">
                   <wp:extent cx="676203" cy="661384"/>
                   <wp:effectExtent l="0" t="0" r="0" b="5715"/>
                   <wp:docPr id="1599987282" name="Imagen 6"/>
@@ -2388,7 +2388,6 @@
         </w:rPr>
       </w:pPr>
       <w:bookmarkStart w:id="0" w:name="_Toc240009001"/>
-      <w:bookmarkStart w:id="1" w:name="_Toc241502987"/>
       <w:r>
         <w:rPr>
           <w:sz w:val="22"/>
@@ -2398,7 +2397,6 @@
         <w:t>1. Selección del requisito</w:t>
       </w:r>
       <w:bookmarkEnd w:id="0"/>
-      <w:bookmarkEnd w:id="1"/>
     </w:p>
     <w:p>
       <w:pPr>
@@ -2991,8 +2989,7 @@
           <w:lang w:val="es-EC"/>
         </w:rPr>
       </w:pPr>
-      <w:bookmarkStart w:id="2" w:name="_Toc240009002"/>
-      <w:bookmarkStart w:id="3" w:name="_Toc241502988"/>
+      <w:bookmarkStart w:id="1" w:name="_Toc240009002"/>
       <w:r>
         <w:rPr>
           <w:sz w:val="22"/>
@@ -3000,8 +2997,7 @@
         </w:rPr>
         <w:t>2. Auditoría técnica del requisito y modelos</w:t>
       </w:r>
-      <w:bookmarkEnd w:id="2"/>
-      <w:bookmarkEnd w:id="3"/>
+      <w:bookmarkEnd w:id="1"/>
     </w:p>
     <w:p>
       <w:pPr>
@@ -3009,7 +3005,18 @@
         <w:jc w:val="both"/>
       </w:pPr>
       <w:r>
-        <w:t>Antes de probar se revisó que el requisito fuera consistente con el caso de uso, el diagrama de clases, la secuencia SEQ01 y el código (Tabla 2). La revisión encontró problemas reales; los que quedaron pendientes en los modelos se registraron como defectos en la sección 6 (Tabla 7).</w:t>
+        <w:t xml:space="preserve">Antes de probar se revisó que el requisito fuera consistente con el caso de uso, el diagrama de clases, la secuencia SEQ01 y el código (Tabla 2). La revisión encontró problemas reales, que se registraron como defectos en la sección 6 (Tabla 7). Los que estaban en los diagramas se corrigieron en una versión 2 guardada en </w:t>
+      </w:r>
+      <w:r>
+        <w:rPr>
+          <w:rFonts w:ascii="Consolas" w:hAnsi="Consolas"/>
+          <w:sz w:val="19"/>
+          <w:szCs w:val="19"/>
+        </w:rPr>
+        <w:t>Ae6/modelos/</w:t>
+      </w:r>
+      <w:r>
+        <w:t>, sin modificar la entrega del Ae5.</w:t>
       </w:r>
     </w:p>
     <w:p>
@@ -3274,7 +3281,7 @@
               <w:rPr>
                 <w:color w:val="222222"/>
               </w:rPr>
-              <w:t>Corregido en el expediente: se agregó CA-04 y se cubre con CP-03. Reflejar la regla en CU01 queda pendiente (DEF-05).</w:t>
+              <w:t>Corregido en el expediente: se agregó CA-04 y se cubre con CP-03. La regla se incorpora a CU01 en la siguiente versión de la especificación (DEF-05).</w:t>
             </w:r>
           </w:p>
         </w:tc>
@@ -3545,7 +3552,7 @@
               <w:rPr>
                 <w:color w:val="222222"/>
               </w:rPr>
-              <w:t xml:space="preserve">En el código se corrigió con </w:t>
+              <w:t xml:space="preserve">En el código se usa </w:t>
             </w:r>
             <w:proofErr w:type="spellStart"/>
             <w:r>
@@ -3579,7 +3586,7 @@
               <w:rPr>
                 <w:color w:val="222222"/>
               </w:rPr>
-              <w:t xml:space="preserve"> (EN_PROCESO, REGISTRADA). En el diagrama queda pendiente (DEF-03).</w:t>
+              <w:t xml:space="preserve"> (EN_PROCESO, REGISTRADA). El diagrama se corrigió en la versión 2 (DEF-03, Figura 6).</w:t>
             </w:r>
           </w:p>
         </w:tc>
@@ -3693,7 +3700,7 @@
               <w:rPr>
                 <w:color w:val="222222"/>
               </w:rPr>
-              <w:t>E2 queda cubierto por CA-03 y CP-04. Agregar el fragmento alternativo en SEQ01 queda pendiente (DEF-04).</w:t>
+              <w:t>E2 queda cubierto por CA-03 y CP-04, y se agregó el fragmento alternativo en SEQ01 versión 2 (DEF-04, Figura 7).</w:t>
             </w:r>
           </w:p>
         </w:tc>
@@ -3981,7 +3988,24 @@
               <w:rPr>
                 <w:color w:val="222222"/>
               </w:rPr>
-              <w:t xml:space="preserve">Se mantiene el diseño del código. Actualizar SEQ01 para que </w:t>
+              <w:t xml:space="preserve">Se mantiene el diseño del código y SEQ01 versión 2 se ajustó a él: </w:t>
+            </w:r>
+            <w:proofErr w:type="spellStart"/>
+            <w:r>
+              <w:rPr>
+                <w:rFonts w:ascii="Consolas" w:hAnsi="Consolas"/>
+                <w:color w:val="222222"/>
+                <w:sz w:val="19"/>
+                <w:szCs w:val="19"/>
+              </w:rPr>
+              <w:t>ControlVenta</w:t>
+            </w:r>
+            <w:proofErr w:type="spellEnd"/>
+            <w:r>
+              <w:rPr>
+                <w:color w:val="222222"/>
+              </w:rPr>
+              <w:t xml:space="preserve"> llama a </w:t>
             </w:r>
             <w:proofErr w:type="spellStart"/>
             <w:proofErr w:type="gramStart"/>
@@ -3992,7 +4016,7 @@
                 <w:sz w:val="19"/>
                 <w:szCs w:val="19"/>
               </w:rPr>
-              <w:t>verificarDisponibilidad</w:t>
+              <w:t>agregarDetalle</w:t>
             </w:r>
             <w:proofErr w:type="spellEnd"/>
             <w:r>
@@ -4018,7 +4042,7 @@
               <w:rPr>
                 <w:color w:val="222222"/>
               </w:rPr>
-              <w:t xml:space="preserve"> la envíe </w:t>
+              <w:t xml:space="preserve"> y </w:t>
             </w:r>
             <w:r>
               <w:rPr>
@@ -4033,7 +4057,44 @@
               <w:rPr>
                 <w:color w:val="222222"/>
               </w:rPr>
-              <w:t xml:space="preserve"> queda pendiente (DEF-04). La lista modificable se registró y corrigió como DEF-02.</w:t>
+              <w:t xml:space="preserve"> envía </w:t>
+            </w:r>
+            <w:proofErr w:type="spellStart"/>
+            <w:proofErr w:type="gramStart"/>
+            <w:r>
+              <w:rPr>
+                <w:rFonts w:ascii="Consolas" w:hAnsi="Consolas"/>
+                <w:color w:val="222222"/>
+                <w:sz w:val="19"/>
+                <w:szCs w:val="19"/>
+              </w:rPr>
+              <w:t>verificarDisponibilidad</w:t>
+            </w:r>
+            <w:proofErr w:type="spellEnd"/>
+            <w:r>
+              <w:rPr>
+                <w:rFonts w:ascii="Consolas" w:hAnsi="Consolas"/>
+                <w:color w:val="222222"/>
+                <w:sz w:val="19"/>
+                <w:szCs w:val="19"/>
+              </w:rPr>
+              <w:t>(</w:t>
+            </w:r>
+            <w:proofErr w:type="gramEnd"/>
+            <w:r>
+              <w:rPr>
+                <w:rFonts w:ascii="Consolas" w:hAnsi="Consolas"/>
+                <w:color w:val="222222"/>
+                <w:sz w:val="19"/>
+                <w:szCs w:val="19"/>
+              </w:rPr>
+              <w:t>)</w:t>
+            </w:r>
+            <w:r>
+              <w:rPr>
+                <w:color w:val="222222"/>
+              </w:rPr>
+              <w:t xml:space="preserve"> (DEF-04, Figura 7). La lista modificable se registró y corrigió como DEF-02.</w:t>
             </w:r>
           </w:p>
         </w:tc>
@@ -4074,7 +4135,7 @@
           <w:noProof/>
         </w:rPr>
         <w:drawing>
-          <wp:inline distT="0" distB="0" distL="0" distR="0" wp14:anchorId="72B33175" wp14:editId="5F7D4FB6">
+          <wp:inline distT="0" distB="0" distL="0" distR="0" wp14:anchorId="4F4F8297" wp14:editId="3851C51B">
             <wp:extent cx="5768340" cy="4716780"/>
             <wp:effectExtent l="0" t="0" r="3810" b="7620"/>
             <wp:docPr id="987234633" name="Imagen 4"/>
@@ -4147,7 +4208,7 @@
           <w:noProof/>
         </w:rPr>
         <w:drawing>
-          <wp:inline distT="0" distB="0" distL="0" distR="0" wp14:anchorId="6567DCD8" wp14:editId="5C90419A">
+          <wp:inline distT="0" distB="0" distL="0" distR="0" wp14:anchorId="34036604" wp14:editId="016D6CB1">
             <wp:extent cx="5303520" cy="5882483"/>
             <wp:effectExtent l="0" t="0" r="0" b="0"/>
             <wp:docPr id="2007843935" name="Picture 2007843935"/>
@@ -4205,8 +4266,7 @@
           <w:lang w:val="es-EC"/>
         </w:rPr>
       </w:pPr>
-      <w:bookmarkStart w:id="4" w:name="_Toc240009003"/>
-      <w:bookmarkStart w:id="5" w:name="_Toc241502989"/>
+      <w:bookmarkStart w:id="2" w:name="_Toc240009003"/>
       <w:r>
         <w:rPr>
           <w:sz w:val="22"/>
@@ -4214,8 +4274,7 @@
         </w:rPr>
         <w:t>3. Criterios de aceptación</w:t>
       </w:r>
-      <w:bookmarkEnd w:id="4"/>
-      <w:bookmarkEnd w:id="5"/>
+      <w:bookmarkEnd w:id="2"/>
     </w:p>
     <w:p>
       <w:pPr>
@@ -5050,8 +5109,7 @@
           <w:lang w:val="es-EC"/>
         </w:rPr>
       </w:pPr>
-      <w:bookmarkStart w:id="6" w:name="_Toc240009004"/>
-      <w:bookmarkStart w:id="7" w:name="_Toc241502990"/>
+      <w:bookmarkStart w:id="3" w:name="_Toc240009004"/>
       <w:r>
         <w:rPr>
           <w:sz w:val="22"/>
@@ -5059,8 +5117,7 @@
         </w:rPr>
         <w:t>4. Diseño de casos de prueba</w:t>
       </w:r>
-      <w:bookmarkEnd w:id="6"/>
-      <w:bookmarkEnd w:id="7"/>
+      <w:bookmarkEnd w:id="3"/>
     </w:p>
     <w:p>
       <w:pPr>
@@ -6858,8 +6915,7 @@
           <w:lang w:val="es-EC"/>
         </w:rPr>
       </w:pPr>
-      <w:bookmarkStart w:id="8" w:name="_Toc240009005"/>
-      <w:bookmarkStart w:id="9" w:name="_Toc241502991"/>
+      <w:bookmarkStart w:id="4" w:name="_Toc240009005"/>
       <w:r>
         <w:rPr>
           <w:sz w:val="22"/>
@@ -6867,8 +6923,7 @@
         </w:rPr>
         <w:t>5. Implementación y ejecución de pruebas</w:t>
       </w:r>
-      <w:bookmarkEnd w:id="8"/>
-      <w:bookmarkEnd w:id="9"/>
+      <w:bookmarkEnd w:id="4"/>
     </w:p>
     <w:p>
       <w:pPr>
@@ -8604,7 +8659,7 @@
         </w:rPr>
         <w:lastRenderedPageBreak/>
         <w:drawing>
-          <wp:inline distT="0" distB="0" distL="0" distR="0" wp14:anchorId="2531A9CE" wp14:editId="7D4C1D26">
+          <wp:inline distT="0" distB="0" distL="0" distR="0" wp14:anchorId="5DEF6F7B" wp14:editId="4594AFD4">
             <wp:extent cx="5760000" cy="1996515"/>
             <wp:effectExtent l="0" t="0" r="0" b="0"/>
             <wp:docPr id="3100" name="captura1-mvn-test-ok.png"/>
@@ -8760,27 +8815,7 @@
                 <w:szCs w:val="14"/>
                 <w:lang w:val="en-US"/>
               </w:rPr>
-              <w:t xml:space="preserve">package </w:t>
-            </w:r>
-            <w:proofErr w:type="gramStart"/>
-            <w:r>
-              <w:rPr>
-                <w:rFonts w:ascii="Consolas" w:hAnsi="Consolas" w:cs="Consolas"/>
-                <w:sz w:val="14"/>
-                <w:szCs w:val="14"/>
-                <w:lang w:val="en-US"/>
-              </w:rPr>
-              <w:t>ec.edu.uees</w:t>
-            </w:r>
-            <w:proofErr w:type="gramEnd"/>
-            <w:r>
-              <w:rPr>
-                <w:rFonts w:ascii="Consolas" w:hAnsi="Consolas" w:cs="Consolas"/>
-                <w:sz w:val="14"/>
-                <w:szCs w:val="14"/>
-                <w:lang w:val="en-US"/>
-              </w:rPr>
-              <w:t>.ucom304.facturacion;</w:t>
+              <w:t>package ec.edu.uees.ucom304.facturacion;</w:t>
             </w:r>
           </w:p>
           <w:p>
@@ -8805,29 +8840,7 @@
                 <w:szCs w:val="14"/>
                 <w:lang w:val="en-US"/>
               </w:rPr>
-              <w:t xml:space="preserve">import </w:t>
-            </w:r>
-            <w:proofErr w:type="spellStart"/>
-            <w:proofErr w:type="gramStart"/>
-            <w:r>
-              <w:rPr>
-                <w:rFonts w:ascii="Consolas" w:hAnsi="Consolas" w:cs="Consolas"/>
-                <w:sz w:val="14"/>
-                <w:szCs w:val="14"/>
-                <w:lang w:val="en-US"/>
-              </w:rPr>
-              <w:t>org.junit.jupiter.api.BeforeEach</w:t>
-            </w:r>
-            <w:proofErr w:type="spellEnd"/>
-            <w:proofErr w:type="gramEnd"/>
-            <w:r>
-              <w:rPr>
-                <w:rFonts w:ascii="Consolas" w:hAnsi="Consolas" w:cs="Consolas"/>
-                <w:sz w:val="14"/>
-                <w:szCs w:val="14"/>
-                <w:lang w:val="en-US"/>
-              </w:rPr>
-              <w:t>;</w:t>
+              <w:t>import org.junit.jupiter.api.BeforeEach;</w:t>
             </w:r>
           </w:p>
           <w:p>
@@ -8844,29 +8857,7 @@
                 <w:szCs w:val="14"/>
                 <w:lang w:val="en-US"/>
               </w:rPr>
-              <w:t xml:space="preserve">import </w:t>
-            </w:r>
-            <w:proofErr w:type="spellStart"/>
-            <w:proofErr w:type="gramStart"/>
-            <w:r>
-              <w:rPr>
-                <w:rFonts w:ascii="Consolas" w:hAnsi="Consolas" w:cs="Consolas"/>
-                <w:sz w:val="14"/>
-                <w:szCs w:val="14"/>
-                <w:lang w:val="en-US"/>
-              </w:rPr>
-              <w:t>org.junit.jupiter.api.Test</w:t>
-            </w:r>
-            <w:proofErr w:type="spellEnd"/>
-            <w:proofErr w:type="gramEnd"/>
-            <w:r>
-              <w:rPr>
-                <w:rFonts w:ascii="Consolas" w:hAnsi="Consolas" w:cs="Consolas"/>
-                <w:sz w:val="14"/>
-                <w:szCs w:val="14"/>
-                <w:lang w:val="en-US"/>
-              </w:rPr>
-              <w:t>;</w:t>
+              <w:t>import org.junit.jupiter.api.Test;</w:t>
             </w:r>
           </w:p>
           <w:p>
@@ -8883,58 +8874,7 @@
                 <w:szCs w:val="14"/>
                 <w:lang w:val="en-US"/>
               </w:rPr>
-              <w:t xml:space="preserve">import </w:t>
-            </w:r>
-            <w:proofErr w:type="spellStart"/>
-            <w:proofErr w:type="gramStart"/>
-            <w:r>
-              <w:rPr>
-                <w:rFonts w:ascii="Consolas" w:hAnsi="Consolas" w:cs="Consolas"/>
-                <w:sz w:val="14"/>
-                <w:szCs w:val="14"/>
-                <w:lang w:val="en-US"/>
-              </w:rPr>
-              <w:t>org.junit</w:t>
-            </w:r>
-            <w:proofErr w:type="gramEnd"/>
-            <w:r>
-              <w:rPr>
-                <w:rFonts w:ascii="Consolas" w:hAnsi="Consolas" w:cs="Consolas"/>
-                <w:sz w:val="14"/>
-                <w:szCs w:val="14"/>
-                <w:lang w:val="en-US"/>
-              </w:rPr>
-              <w:t>.</w:t>
-            </w:r>
-            <w:proofErr w:type="gramStart"/>
-            <w:r>
-              <w:rPr>
-                <w:rFonts w:ascii="Consolas" w:hAnsi="Consolas" w:cs="Consolas"/>
-                <w:sz w:val="14"/>
-                <w:szCs w:val="14"/>
-                <w:lang w:val="en-US"/>
-              </w:rPr>
-              <w:t>jupiter.params</w:t>
-            </w:r>
-            <w:proofErr w:type="gramEnd"/>
-            <w:r>
-              <w:rPr>
-                <w:rFonts w:ascii="Consolas" w:hAnsi="Consolas" w:cs="Consolas"/>
-                <w:sz w:val="14"/>
-                <w:szCs w:val="14"/>
-                <w:lang w:val="en-US"/>
-              </w:rPr>
-              <w:t>.ParameterizedTest</w:t>
-            </w:r>
-            <w:proofErr w:type="spellEnd"/>
-            <w:r>
-              <w:rPr>
-                <w:rFonts w:ascii="Consolas" w:hAnsi="Consolas" w:cs="Consolas"/>
-                <w:sz w:val="14"/>
-                <w:szCs w:val="14"/>
-                <w:lang w:val="en-US"/>
-              </w:rPr>
-              <w:t>;</w:t>
+              <w:t>import org.junit.jupiter.params.ParameterizedTest;</w:t>
             </w:r>
           </w:p>
           <w:p>
@@ -8951,69 +8891,7 @@
                 <w:szCs w:val="14"/>
                 <w:lang w:val="en-US"/>
               </w:rPr>
-              <w:t xml:space="preserve">import </w:t>
-            </w:r>
-            <w:proofErr w:type="spellStart"/>
-            <w:proofErr w:type="gramStart"/>
-            <w:r>
-              <w:rPr>
-                <w:rFonts w:ascii="Consolas" w:hAnsi="Consolas" w:cs="Consolas"/>
-                <w:sz w:val="14"/>
-                <w:szCs w:val="14"/>
-                <w:lang w:val="en-US"/>
-              </w:rPr>
-              <w:t>org.junit</w:t>
-            </w:r>
-            <w:proofErr w:type="gramEnd"/>
-            <w:r>
-              <w:rPr>
-                <w:rFonts w:ascii="Consolas" w:hAnsi="Consolas" w:cs="Consolas"/>
-                <w:sz w:val="14"/>
-                <w:szCs w:val="14"/>
-                <w:lang w:val="en-US"/>
-              </w:rPr>
-              <w:t>.</w:t>
-            </w:r>
-            <w:proofErr w:type="gramStart"/>
-            <w:r>
-              <w:rPr>
-                <w:rFonts w:ascii="Consolas" w:hAnsi="Consolas" w:cs="Consolas"/>
-                <w:sz w:val="14"/>
-                <w:szCs w:val="14"/>
-                <w:lang w:val="en-US"/>
-              </w:rPr>
-              <w:t>jupiter.params</w:t>
-            </w:r>
-            <w:proofErr w:type="gramEnd"/>
-            <w:r>
-              <w:rPr>
-                <w:rFonts w:ascii="Consolas" w:hAnsi="Consolas" w:cs="Consolas"/>
-                <w:sz w:val="14"/>
-                <w:szCs w:val="14"/>
-                <w:lang w:val="en-US"/>
-              </w:rPr>
-              <w:t>.</w:t>
-            </w:r>
-            <w:proofErr w:type="gramStart"/>
-            <w:r>
-              <w:rPr>
-                <w:rFonts w:ascii="Consolas" w:hAnsi="Consolas" w:cs="Consolas"/>
-                <w:sz w:val="14"/>
-                <w:szCs w:val="14"/>
-                <w:lang w:val="en-US"/>
-              </w:rPr>
-              <w:t>provider.ValueSource</w:t>
-            </w:r>
-            <w:proofErr w:type="spellEnd"/>
-            <w:proofErr w:type="gramEnd"/>
-            <w:r>
-              <w:rPr>
-                <w:rFonts w:ascii="Consolas" w:hAnsi="Consolas" w:cs="Consolas"/>
-                <w:sz w:val="14"/>
-                <w:szCs w:val="14"/>
-                <w:lang w:val="en-US"/>
-              </w:rPr>
-              <w:t>;</w:t>
+              <w:t>import org.junit.jupiter.params.provider.ValueSource;</w:t>
             </w:r>
           </w:p>
           <w:p>
@@ -9038,27 +8916,7 @@
                 <w:szCs w:val="14"/>
                 <w:lang w:val="en-US"/>
               </w:rPr>
-              <w:t xml:space="preserve">import </w:t>
-            </w:r>
-            <w:proofErr w:type="gramStart"/>
-            <w:r>
-              <w:rPr>
-                <w:rFonts w:ascii="Consolas" w:hAnsi="Consolas" w:cs="Consolas"/>
-                <w:sz w:val="14"/>
-                <w:szCs w:val="14"/>
-                <w:lang w:val="en-US"/>
-              </w:rPr>
-              <w:t>java.math</w:t>
-            </w:r>
-            <w:proofErr w:type="gramEnd"/>
-            <w:r>
-              <w:rPr>
-                <w:rFonts w:ascii="Consolas" w:hAnsi="Consolas" w:cs="Consolas"/>
-                <w:sz w:val="14"/>
-                <w:szCs w:val="14"/>
-                <w:lang w:val="en-US"/>
-              </w:rPr>
-              <w:t>.BigDecimal;</w:t>
+              <w:t>import java.math.BigDecimal;</w:t>
             </w:r>
           </w:p>
           <w:p>
@@ -9083,27 +8941,7 @@
                 <w:szCs w:val="14"/>
                 <w:lang w:val="en-US"/>
               </w:rPr>
-              <w:t xml:space="preserve">import static </w:t>
-            </w:r>
-            <w:proofErr w:type="gramStart"/>
-            <w:r>
-              <w:rPr>
-                <w:rFonts w:ascii="Consolas" w:hAnsi="Consolas" w:cs="Consolas"/>
-                <w:sz w:val="14"/>
-                <w:szCs w:val="14"/>
-                <w:lang w:val="en-US"/>
-              </w:rPr>
-              <w:t>org.junit.jupiter.api.Assertions</w:t>
-            </w:r>
-            <w:proofErr w:type="gramEnd"/>
-            <w:r>
-              <w:rPr>
-                <w:rFonts w:ascii="Consolas" w:hAnsi="Consolas" w:cs="Consolas"/>
-                <w:sz w:val="14"/>
-                <w:szCs w:val="14"/>
-                <w:lang w:val="en-US"/>
-              </w:rPr>
-              <w:t>.*;</w:t>
+              <w:t>import static org.junit.jupiter.api.Assertions.*;</w:t>
             </w:r>
           </w:p>
           <w:p>
@@ -15322,8 +15160,7 @@
           <w:lang w:val="es-EC"/>
         </w:rPr>
       </w:pPr>
-      <w:bookmarkStart w:id="10" w:name="_Toc240009006"/>
-      <w:bookmarkStart w:id="11" w:name="_Toc241502992"/>
+      <w:bookmarkStart w:id="5" w:name="_Toc240009006"/>
       <w:r>
         <w:rPr>
           <w:sz w:val="22"/>
@@ -15331,8 +15168,7 @@
         </w:rPr>
         <w:t>6. Gestión de defectos</w:t>
       </w:r>
-      <w:bookmarkEnd w:id="10"/>
-      <w:bookmarkEnd w:id="11"/>
+      <w:bookmarkEnd w:id="5"/>
     </w:p>
     <w:p>
       <w:pPr>
@@ -16085,12 +15921,24 @@
               <w:rPr>
                 <w:color w:val="222222"/>
               </w:rPr>
-              <w:t xml:space="preserve"> "Ae6 DEF-01: defecto inyectado en </w:t>
+              <w:t xml:space="preserve"> </w:t>
+            </w:r>
+            <w:r>
+              <w:rPr>
+                <w:rFonts w:ascii="Consolas" w:hAnsi="Consolas"/>
+                <w:color w:val="222222"/>
+                <w:sz w:val="19"/>
+                <w:szCs w:val="19"/>
+              </w:rPr>
+              <w:t xml:space="preserve">Ae6 DEF-01: defecto inyectado en </w:t>
             </w:r>
             <w:proofErr w:type="spellStart"/>
             <w:r>
               <w:rPr>
-                <w:color w:val="222222"/>
+                <w:rFonts w:ascii="Consolas" w:hAnsi="Consolas"/>
+                <w:color w:val="222222"/>
+                <w:sz w:val="19"/>
+                <w:szCs w:val="19"/>
               </w:rPr>
               <w:t>DetalleVenta.calcularSubtotal</w:t>
             </w:r>
@@ -16099,12 +15947,24 @@
               <w:rPr>
                 <w:color w:val="222222"/>
               </w:rPr>
-              <w:t xml:space="preserve">" y "Ae6 DEF-01: corrección, subtotal con </w:t>
+              <w:t xml:space="preserve"> y </w:t>
+            </w:r>
+            <w:r>
+              <w:rPr>
+                <w:rFonts w:ascii="Consolas" w:hAnsi="Consolas"/>
+                <w:color w:val="222222"/>
+                <w:sz w:val="19"/>
+                <w:szCs w:val="19"/>
+              </w:rPr>
+              <w:t xml:space="preserve">Ae6 DEF-01: corrección, subtotal con </w:t>
             </w:r>
             <w:proofErr w:type="spellStart"/>
             <w:r>
               <w:rPr>
-                <w:color w:val="222222"/>
+                <w:rFonts w:ascii="Consolas" w:hAnsi="Consolas"/>
+                <w:color w:val="222222"/>
+                <w:sz w:val="19"/>
+                <w:szCs w:val="19"/>
               </w:rPr>
               <w:t>precioUnitario</w:t>
             </w:r>
@@ -16113,7 +15973,7 @@
               <w:rPr>
                 <w:color w:val="222222"/>
               </w:rPr>
-              <w:t xml:space="preserve">". Corrección: calcular el subtotal con </w:t>
+              <w:t xml:space="preserve">. Corrección: calcular el subtotal con </w:t>
             </w:r>
             <w:proofErr w:type="spellStart"/>
             <w:r>
@@ -16206,7 +16066,7 @@
           <w:noProof/>
         </w:rPr>
         <w:drawing>
-          <wp:inline distT="0" distB="0" distL="0" distR="0" wp14:anchorId="6C07286C" wp14:editId="69A6AD8B">
+          <wp:inline distT="0" distB="0" distL="0" distR="0" wp14:anchorId="742A3DC4" wp14:editId="13907BAC">
             <wp:extent cx="5760000" cy="3026802"/>
             <wp:effectExtent l="0" t="0" r="0" b="0"/>
             <wp:docPr id="3101" name="captura2-def01-falla.png"/>
@@ -16274,7 +16134,7 @@
           <w:noProof/>
         </w:rPr>
         <w:drawing>
-          <wp:inline distT="0" distB="0" distL="0" distR="0" wp14:anchorId="3A5CA682" wp14:editId="0F6C8A1E">
+          <wp:inline distT="0" distB="0" distL="0" distR="0" wp14:anchorId="28E52584" wp14:editId="79DCFCFC">
             <wp:extent cx="5760000" cy="1951735"/>
             <wp:effectExtent l="0" t="0" r="0" b="0"/>
             <wp:docPr id="3102" name="captura3-def01-corregido.png"/>
@@ -16781,7 +16641,24 @@
                 <w:sz w:val="17"/>
                 <w:szCs w:val="17"/>
               </w:rPr>
-              <w:t xml:space="preserve"> "Ae6: se deja de versionar target". CP-08 pasa con la corrección (Figura 3)</w:t>
+              <w:t xml:space="preserve"> </w:t>
+            </w:r>
+            <w:r>
+              <w:rPr>
+                <w:rFonts w:ascii="Consolas" w:hAnsi="Consolas"/>
+                <w:color w:val="222222"/>
+                <w:sz w:val="15"/>
+                <w:szCs w:val="15"/>
+              </w:rPr>
+              <w:t>Ae6: se deja de versionar target</w:t>
+            </w:r>
+            <w:r>
+              <w:rPr>
+                <w:color w:val="222222"/>
+                <w:sz w:val="17"/>
+                <w:szCs w:val="17"/>
+              </w:rPr>
+              <w:t>. CP-08 pasa con la corrección (Figura 3)</w:t>
             </w:r>
           </w:p>
         </w:tc>
@@ -17041,6 +16918,14 @@
           <w:p>
             <w:r>
               <w:rPr>
+                <w:color w:val="222222"/>
+                <w:sz w:val="17"/>
+                <w:szCs w:val="17"/>
+              </w:rPr>
+              <w:t xml:space="preserve">Antes: </w:t>
+            </w:r>
+            <w:r>
+              <w:rPr>
                 <w:rFonts w:ascii="Consolas" w:hAnsi="Consolas"/>
                 <w:color w:val="222222"/>
                 <w:sz w:val="15"/>
@@ -17067,36 +16952,53 @@
                 <w:sz w:val="17"/>
                 <w:szCs w:val="17"/>
               </w:rPr>
-              <w:t xml:space="preserve"> del Ae5</w:t>
-            </w:r>
-          </w:p>
-        </w:tc>
-        <w:tc>
-          <w:tcPr>
-            <w:tcW w:w="1579" w:type="dxa"/>
-            <w:tcBorders>
-              <w:top w:val="single" w:sz="5" w:space="0" w:color="D0D0D0"/>
-              <w:left w:val="single" w:sz="5" w:space="0" w:color="D0D0D0"/>
-              <w:bottom w:val="single" w:sz="5" w:space="0" w:color="D0D0D0"/>
-              <w:right w:val="single" w:sz="5" w:space="0" w:color="D0D0D0"/>
-            </w:tcBorders>
-            <w:shd w:val="clear" w:color="auto" w:fill="FFFFFF"/>
-            <w:tcMar>
-              <w:top w:w="70" w:type="dxa"/>
-              <w:left w:w="80" w:type="dxa"/>
-              <w:bottom w:w="70" w:type="dxa"/>
-              <w:right w:w="80" w:type="dxa"/>
-            </w:tcMar>
-            <w:vAlign w:val="center"/>
-          </w:tcPr>
-          <w:p>
+              <w:t xml:space="preserve"> del Ae5 (Figura 1). Después: </w:t>
+            </w:r>
+            <w:r>
+              <w:rPr>
+                <w:rFonts w:ascii="Consolas" w:hAnsi="Consolas"/>
+                <w:color w:val="222222"/>
+                <w:sz w:val="15"/>
+                <w:szCs w:val="15"/>
+              </w:rPr>
+              <w:t>Ae6/modelos/diagrama-clases-v2.drawio</w:t>
+            </w:r>
             <w:r>
               <w:rPr>
                 <w:color w:val="222222"/>
                 <w:sz w:val="17"/>
                 <w:szCs w:val="17"/>
               </w:rPr>
-              <w:t xml:space="preserve">Abierto: corregido en el código; pendiente actualizar el diagrama a </w:t>
+              <w:t xml:space="preserve"> (Figura 6)</w:t>
+            </w:r>
+          </w:p>
+        </w:tc>
+        <w:tc>
+          <w:tcPr>
+            <w:tcW w:w="1579" w:type="dxa"/>
+            <w:tcBorders>
+              <w:top w:val="single" w:sz="5" w:space="0" w:color="D0D0D0"/>
+              <w:left w:val="single" w:sz="5" w:space="0" w:color="D0D0D0"/>
+              <w:bottom w:val="single" w:sz="5" w:space="0" w:color="D0D0D0"/>
+              <w:right w:val="single" w:sz="5" w:space="0" w:color="D0D0D0"/>
+            </w:tcBorders>
+            <w:shd w:val="clear" w:color="auto" w:fill="FFFFFF"/>
+            <w:tcMar>
+              <w:top w:w="70" w:type="dxa"/>
+              <w:left w:w="80" w:type="dxa"/>
+              <w:bottom w:w="70" w:type="dxa"/>
+              <w:right w:w="80" w:type="dxa"/>
+            </w:tcMar>
+            <w:vAlign w:val="center"/>
+          </w:tcPr>
+          <w:p>
+            <w:r>
+              <w:rPr>
+                <w:color w:val="222222"/>
+                <w:sz w:val="17"/>
+                <w:szCs w:val="17"/>
+              </w:rPr>
+              <w:t xml:space="preserve">Corregido y verificado: montos en </w:t>
             </w:r>
             <w:proofErr w:type="spellStart"/>
             <w:r>
@@ -17115,9 +17017,8 @@
                 <w:sz w:val="17"/>
                 <w:szCs w:val="17"/>
               </w:rPr>
-              <w:t xml:space="preserve"> y </w:t>
-            </w:r>
-            <w:proofErr w:type="spellStart"/>
+              <w:t xml:space="preserve">, </w:t>
+            </w:r>
             <w:r>
               <w:rPr>
                 <w:rFonts w:ascii="Consolas" w:hAnsi="Consolas"/>
@@ -17125,9 +17026,46 @@
                 <w:sz w:val="15"/>
                 <w:szCs w:val="15"/>
               </w:rPr>
+              <w:t xml:space="preserve">estado: </w:t>
+            </w:r>
+            <w:proofErr w:type="spellStart"/>
+            <w:r>
+              <w:rPr>
+                <w:rFonts w:ascii="Consolas" w:hAnsi="Consolas"/>
+                <w:color w:val="222222"/>
+                <w:sz w:val="15"/>
+                <w:szCs w:val="15"/>
+              </w:rPr>
               <w:t>EstadoVenta</w:t>
             </w:r>
             <w:proofErr w:type="spellEnd"/>
+            <w:r>
+              <w:rPr>
+                <w:color w:val="222222"/>
+                <w:sz w:val="17"/>
+                <w:szCs w:val="17"/>
+              </w:rPr>
+              <w:t xml:space="preserve"> y nueva enumeración </w:t>
+            </w:r>
+            <w:proofErr w:type="spellStart"/>
+            <w:r>
+              <w:rPr>
+                <w:rFonts w:ascii="Consolas" w:hAnsi="Consolas"/>
+                <w:color w:val="222222"/>
+                <w:sz w:val="15"/>
+                <w:szCs w:val="15"/>
+              </w:rPr>
+              <w:t>EstadoVenta</w:t>
+            </w:r>
+            <w:proofErr w:type="spellEnd"/>
+            <w:r>
+              <w:rPr>
+                <w:color w:val="222222"/>
+                <w:sz w:val="17"/>
+                <w:szCs w:val="17"/>
+              </w:rPr>
+              <w:t>, igual que el código</w:t>
+            </w:r>
           </w:p>
         </w:tc>
       </w:tr>
@@ -17301,6 +17239,14 @@
           <w:p>
             <w:r>
               <w:rPr>
+                <w:color w:val="222222"/>
+                <w:sz w:val="17"/>
+                <w:szCs w:val="17"/>
+              </w:rPr>
+              <w:t xml:space="preserve">Antes: </w:t>
+            </w:r>
+            <w:r>
+              <w:rPr>
                 <w:rFonts w:ascii="Consolas" w:hAnsi="Consolas"/>
                 <w:color w:val="222222"/>
                 <w:sz w:val="15"/>
@@ -17325,36 +17271,137 @@
                 <w:sz w:val="17"/>
                 <w:szCs w:val="17"/>
               </w:rPr>
-              <w:t xml:space="preserve"> del Ae5</w:t>
-            </w:r>
-          </w:p>
-        </w:tc>
-        <w:tc>
-          <w:tcPr>
-            <w:tcW w:w="1579" w:type="dxa"/>
-            <w:tcBorders>
-              <w:top w:val="single" w:sz="5" w:space="0" w:color="D0D0D0"/>
-              <w:left w:val="single" w:sz="5" w:space="0" w:color="D0D0D0"/>
-              <w:bottom w:val="single" w:sz="5" w:space="0" w:color="D0D0D0"/>
-              <w:right w:val="single" w:sz="5" w:space="0" w:color="D0D0D0"/>
-            </w:tcBorders>
-            <w:shd w:val="clear" w:color="auto" w:fill="FFFFFF"/>
-            <w:tcMar>
-              <w:top w:w="70" w:type="dxa"/>
-              <w:left w:w="80" w:type="dxa"/>
-              <w:bottom w:w="70" w:type="dxa"/>
-              <w:right w:w="80" w:type="dxa"/>
-            </w:tcMar>
-            <w:vAlign w:val="center"/>
-          </w:tcPr>
-          <w:p>
+              <w:t xml:space="preserve"> del Ae5 (Figura 2). Después: </w:t>
+            </w:r>
+            <w:r>
+              <w:rPr>
+                <w:rFonts w:ascii="Consolas" w:hAnsi="Consolas"/>
+                <w:color w:val="222222"/>
+                <w:sz w:val="15"/>
+                <w:szCs w:val="15"/>
+              </w:rPr>
+              <w:t>Ae6/modelos/SEQ01-registrar-venta-v2.drawio</w:t>
+            </w:r>
             <w:r>
               <w:rPr>
                 <w:color w:val="222222"/>
                 <w:sz w:val="17"/>
                 <w:szCs w:val="17"/>
               </w:rPr>
-              <w:t>Abierto: pendiente agregar el fragmento alternativo y cambiar el emisor del mensaje 6</w:t>
+              <w:t xml:space="preserve"> (Figura 7)</w:t>
+            </w:r>
+          </w:p>
+        </w:tc>
+        <w:tc>
+          <w:tcPr>
+            <w:tcW w:w="1579" w:type="dxa"/>
+            <w:tcBorders>
+              <w:top w:val="single" w:sz="5" w:space="0" w:color="D0D0D0"/>
+              <w:left w:val="single" w:sz="5" w:space="0" w:color="D0D0D0"/>
+              <w:bottom w:val="single" w:sz="5" w:space="0" w:color="D0D0D0"/>
+              <w:right w:val="single" w:sz="5" w:space="0" w:color="D0D0D0"/>
+            </w:tcBorders>
+            <w:shd w:val="clear" w:color="auto" w:fill="FFFFFF"/>
+            <w:tcMar>
+              <w:top w:w="70" w:type="dxa"/>
+              <w:left w:w="80" w:type="dxa"/>
+              <w:bottom w:w="70" w:type="dxa"/>
+              <w:right w:w="80" w:type="dxa"/>
+            </w:tcMar>
+            <w:vAlign w:val="center"/>
+          </w:tcPr>
+          <w:p>
+            <w:r>
+              <w:rPr>
+                <w:color w:val="222222"/>
+                <w:sz w:val="17"/>
+                <w:szCs w:val="17"/>
+              </w:rPr>
+              <w:t xml:space="preserve">Corregido y verificado: </w:t>
+            </w:r>
+            <w:r>
+              <w:rPr>
+                <w:rFonts w:ascii="Consolas" w:hAnsi="Consolas"/>
+                <w:color w:val="222222"/>
+                <w:sz w:val="15"/>
+                <w:szCs w:val="15"/>
+              </w:rPr>
+              <w:t>Venta</w:t>
+            </w:r>
+            <w:r>
+              <w:rPr>
+                <w:color w:val="222222"/>
+                <w:sz w:val="17"/>
+                <w:szCs w:val="17"/>
+              </w:rPr>
+              <w:t xml:space="preserve"> envía </w:t>
+            </w:r>
+            <w:proofErr w:type="spellStart"/>
+            <w:proofErr w:type="gramStart"/>
+            <w:r>
+              <w:rPr>
+                <w:rFonts w:ascii="Consolas" w:hAnsi="Consolas"/>
+                <w:color w:val="222222"/>
+                <w:sz w:val="15"/>
+                <w:szCs w:val="15"/>
+              </w:rPr>
+              <w:t>verificarDisponibilidad</w:t>
+            </w:r>
+            <w:proofErr w:type="spellEnd"/>
+            <w:r>
+              <w:rPr>
+                <w:rFonts w:ascii="Consolas" w:hAnsi="Consolas"/>
+                <w:color w:val="222222"/>
+                <w:sz w:val="15"/>
+                <w:szCs w:val="15"/>
+              </w:rPr>
+              <w:t>(</w:t>
+            </w:r>
+            <w:proofErr w:type="gramEnd"/>
+            <w:r>
+              <w:rPr>
+                <w:rFonts w:ascii="Consolas" w:hAnsi="Consolas"/>
+                <w:color w:val="222222"/>
+                <w:sz w:val="15"/>
+                <w:szCs w:val="15"/>
+              </w:rPr>
+              <w:t>)</w:t>
+            </w:r>
+            <w:r>
+              <w:rPr>
+                <w:color w:val="222222"/>
+                <w:sz w:val="17"/>
+                <w:szCs w:val="17"/>
+              </w:rPr>
+              <w:t xml:space="preserve"> y se agregó </w:t>
+            </w:r>
+            <w:proofErr w:type="spellStart"/>
+            <w:r>
+              <w:rPr>
+                <w:rFonts w:ascii="Consolas" w:hAnsi="Consolas"/>
+                <w:color w:val="222222"/>
+                <w:sz w:val="15"/>
+                <w:szCs w:val="15"/>
+              </w:rPr>
+              <w:t>alt</w:t>
+            </w:r>
+            <w:proofErr w:type="spellEnd"/>
+            <w:r>
+              <w:rPr>
+                <w:rFonts w:ascii="Consolas" w:hAnsi="Consolas"/>
+                <w:color w:val="222222"/>
+                <w:sz w:val="15"/>
+                <w:szCs w:val="15"/>
+              </w:rPr>
+              <w:t xml:space="preserve"> [venta con productos] / [sin productos]</w:t>
+            </w:r>
+            <w:r>
+              <w:rPr>
+                <w:color w:val="222222"/>
+                <w:sz w:val="17"/>
+                <w:szCs w:val="17"/>
+              </w:rPr>
+              <w:t xml:space="preserve"> con el mensaje 28</w:t>
             </w:r>
           </w:p>
         </w:tc>
@@ -17534,12 +17581,199 @@
                 <w:sz w:val="17"/>
                 <w:szCs w:val="17"/>
               </w:rPr>
-              <w:t>Corregido en el expediente con CA-04 y CP-03; pendiente reflejarlo en CU01</w:t>
+              <w:t>Corregido en el expediente con CA-04 y CP-03; la regla se incorpora a CU01 en la siguiente versión de la especificación</w:t>
             </w:r>
           </w:p>
         </w:tc>
       </w:tr>
     </w:tbl>
+    <w:p>
+      <w:pPr>
+        <w:spacing w:line="259" w:lineRule="auto"/>
+        <w:jc w:val="both"/>
+      </w:pPr>
+      <w:r>
+        <w:t xml:space="preserve">Las Figuras 6 y 7 muestran los diagramas corregidos (versión 2). Se verificaron comparándolos contra el código: los tipos, la enumeración y el orden de los mensajes coinciden con </w:t>
+      </w:r>
+      <w:r>
+        <w:rPr>
+          <w:rFonts w:ascii="Consolas" w:hAnsi="Consolas"/>
+          <w:sz w:val="19"/>
+          <w:szCs w:val="19"/>
+        </w:rPr>
+        <w:t>Venta</w:t>
+      </w:r>
+      <w:r>
+        <w:t xml:space="preserve">, </w:t>
+      </w:r>
+      <w:proofErr w:type="spellStart"/>
+      <w:r>
+        <w:rPr>
+          <w:rFonts w:ascii="Consolas" w:hAnsi="Consolas"/>
+          <w:sz w:val="19"/>
+          <w:szCs w:val="19"/>
+        </w:rPr>
+        <w:t>DetalleVenta</w:t>
+      </w:r>
+      <w:proofErr w:type="spellEnd"/>
+      <w:r>
+        <w:t xml:space="preserve">, </w:t>
+      </w:r>
+      <w:r>
+        <w:rPr>
+          <w:rFonts w:ascii="Consolas" w:hAnsi="Consolas"/>
+          <w:sz w:val="19"/>
+          <w:szCs w:val="19"/>
+        </w:rPr>
+        <w:t>Producto</w:t>
+      </w:r>
+      <w:r>
+        <w:t xml:space="preserve"> y </w:t>
+      </w:r>
+      <w:proofErr w:type="spellStart"/>
+      <w:r>
+        <w:rPr>
+          <w:rFonts w:ascii="Consolas" w:hAnsi="Consolas"/>
+          <w:sz w:val="19"/>
+          <w:szCs w:val="19"/>
+        </w:rPr>
+        <w:t>ServicioVenta</w:t>
+      </w:r>
+      <w:proofErr w:type="spellEnd"/>
+      <w:r>
+        <w:t>.</w:t>
+      </w:r>
+    </w:p>
+    <w:p>
+      <w:pPr>
+        <w:spacing w:before="240" w:after="120" w:line="259" w:lineRule="auto"/>
+        <w:jc w:val="center"/>
+      </w:pPr>
+      <w:r>
+        <w:rPr>
+          <w:noProof/>
+        </w:rPr>
+        <w:lastRenderedPageBreak/>
+        <w:drawing>
+          <wp:inline distT="0" distB="0" distL="0" distR="0" wp14:anchorId="2DE24D0E" wp14:editId="5DB2CF27">
+            <wp:extent cx="5760000" cy="5246414"/>
+            <wp:effectExtent l="0" t="0" r="0" b="0"/>
+            <wp:docPr id="3200" name="diagrama-clases-v2.png"/>
+            <wp:cNvGraphicFramePr>
+              <a:graphicFrameLocks xmlns:a="http://schemas.openxmlformats.org/drawingml/2006/main" noChangeAspect="1"/>
+            </wp:cNvGraphicFramePr>
+            <a:graphic xmlns:a="http://schemas.openxmlformats.org/drawingml/2006/main">
+              <a:graphicData uri="http://schemas.openxmlformats.org/drawingml/2006/picture">
+                <pic:pic xmlns:pic="http://schemas.openxmlformats.org/drawingml/2006/picture">
+                  <pic:nvPicPr>
+                    <pic:cNvPr id="0" name="diagrama-clases-v2.png"/>
+                    <pic:cNvPicPr/>
+                  </pic:nvPicPr>
+                  <pic:blipFill>
+                    <a:blip r:embed="rId20"/>
+                    <a:stretch>
+                      <a:fillRect/>
+                    </a:stretch>
+                  </pic:blipFill>
+                  <pic:spPr>
+                    <a:xfrm>
+                      <a:off x="0" y="0"/>
+                      <a:ext cx="5760000" cy="5246414"/>
+                    </a:xfrm>
+                    <a:prstGeom prst="rect">
+                      <a:avLst/>
+                    </a:prstGeom>
+                    <a:ln w="6350">
+                      <a:solidFill>
+                        <a:srgbClr val="D0D0D0"/>
+                      </a:solidFill>
+                    </a:ln>
+                  </pic:spPr>
+                </pic:pic>
+              </a:graphicData>
+            </a:graphic>
+          </wp:inline>
+        </w:drawing>
+      </w:r>
+    </w:p>
+    <w:p>
+      <w:pPr>
+        <w:spacing w:line="259" w:lineRule="auto"/>
+        <w:jc w:val="center"/>
+      </w:pPr>
+      <w:r>
+        <w:rPr>
+          <w:i/>
+          <w:sz w:val="18"/>
+        </w:rPr>
+        <w:t>Figura 6. Diagrama de clases corregido (versión 2, DEF-03)</w:t>
+      </w:r>
+    </w:p>
+    <w:p>
+      <w:pPr>
+        <w:spacing w:before="240" w:after="120" w:line="259" w:lineRule="auto"/>
+        <w:jc w:val="center"/>
+      </w:pPr>
+      <w:r>
+        <w:rPr>
+          <w:noProof/>
+        </w:rPr>
+        <w:lastRenderedPageBreak/>
+        <w:drawing>
+          <wp:inline distT="0" distB="0" distL="0" distR="0" wp14:anchorId="2FC1E66F" wp14:editId="3CB1ECF1">
+            <wp:extent cx="4900000" cy="6039886"/>
+            <wp:effectExtent l="0" t="0" r="0" b="0"/>
+            <wp:docPr id="3201" name="SEQ01-registrar-venta-v2.png"/>
+            <wp:cNvGraphicFramePr>
+              <a:graphicFrameLocks xmlns:a="http://schemas.openxmlformats.org/drawingml/2006/main" noChangeAspect="1"/>
+            </wp:cNvGraphicFramePr>
+            <a:graphic xmlns:a="http://schemas.openxmlformats.org/drawingml/2006/main">
+              <a:graphicData uri="http://schemas.openxmlformats.org/drawingml/2006/picture">
+                <pic:pic xmlns:pic="http://schemas.openxmlformats.org/drawingml/2006/picture">
+                  <pic:nvPicPr>
+                    <pic:cNvPr id="0" name="SEQ01-registrar-venta-v2.png"/>
+                    <pic:cNvPicPr/>
+                  </pic:nvPicPr>
+                  <pic:blipFill>
+                    <a:blip r:embed="rId21"/>
+                    <a:stretch>
+                      <a:fillRect/>
+                    </a:stretch>
+                  </pic:blipFill>
+                  <pic:spPr>
+                    <a:xfrm>
+                      <a:off x="0" y="0"/>
+                      <a:ext cx="4900000" cy="6039886"/>
+                    </a:xfrm>
+                    <a:prstGeom prst="rect">
+                      <a:avLst/>
+                    </a:prstGeom>
+                    <a:ln w="6350">
+                      <a:solidFill>
+                        <a:srgbClr val="D0D0D0"/>
+                      </a:solidFill>
+                    </a:ln>
+                  </pic:spPr>
+                </pic:pic>
+              </a:graphicData>
+            </a:graphic>
+          </wp:inline>
+        </w:drawing>
+      </w:r>
+    </w:p>
+    <w:p>
+      <w:pPr>
+        <w:spacing w:line="259" w:lineRule="auto"/>
+        <w:jc w:val="center"/>
+      </w:pPr>
+      <w:r>
+        <w:rPr>
+          <w:i/>
+          <w:sz w:val="18"/>
+        </w:rPr>
+        <w:t>Figura 7. SEQ01 Registrar venta corregido (versión 2, DEF-04)</w:t>
+      </w:r>
+    </w:p>
     <w:p>
       <w:pPr>
         <w:pStyle w:val="UEESH1"/>
@@ -17549,8 +17783,7 @@
           <w:lang w:val="es-EC"/>
         </w:rPr>
       </w:pPr>
-      <w:bookmarkStart w:id="12" w:name="_Toc240009007"/>
-      <w:bookmarkStart w:id="13" w:name="_Toc241502993"/>
+      <w:bookmarkStart w:id="6" w:name="_Toc240009007"/>
       <w:r>
         <w:rPr>
           <w:sz w:val="22"/>
@@ -17566,8 +17799,7 @@
         </w:rPr>
         <w:t>stakeholder</w:t>
       </w:r>
-      <w:bookmarkEnd w:id="12"/>
-      <w:bookmarkEnd w:id="13"/>
+      <w:bookmarkEnd w:id="6"/>
       <w:proofErr w:type="spellEnd"/>
     </w:p>
     <w:p>
@@ -17576,7 +17808,7 @@
         <w:jc w:val="both"/>
       </w:pPr>
       <w:r>
-        <w:t>Las pruebas anteriores son verificación: comprueban que el sistema hace lo que dice el requisito. La validación comprueba que el requisito responde a una necesidad real del negocio (Sommerville, 2016). Por eso se propone validar RF01 con el cajero, que es quien usa el sistema al atender al cliente, contra la necesidad N01 del Ae2 (registrar una venta eligiendo los productos del pedido) y el RNF01 (registrar la venta en máximo 3 pasos). La Tabla 8 detalla la propuesta.</w:t>
+        <w:t>Las pruebas anteriores son verificación: comprueban que el sistema hace lo que dice el requisito. La validación comprueba que el requisito responde a una necesidad real del negocio (Sommerville, 2016). Por eso se propone validar RF01 con el cajero, que es quien usa el sistema al atender al cliente, contra la necesidad N01 del Ae2 (registrar una venta eligiendo los productos del pedido) y el RNF01 (completar el registro de una venta en un máximo de 2 a 3 pasos). La Tabla 8 detalla la propuesta.</w:t>
       </w:r>
     </w:p>
     <w:p>
@@ -17774,6 +18006,7 @@
               <w:rPr>
                 <w:color w:val="222222"/>
               </w:rPr>
+              <w:lastRenderedPageBreak/>
               <w:t>Escenario de validación</w:t>
             </w:r>
           </w:p>
@@ -17834,7 +18067,6 @@
               <w:rPr>
                 <w:color w:val="222222"/>
               </w:rPr>
-              <w:lastRenderedPageBreak/>
               <w:t>Tarea que realizará</w:t>
             </w:r>
           </w:p>
@@ -18026,7 +18258,7 @@
               <w:rPr>
                 <w:color w:val="222222"/>
               </w:rPr>
-              <w:t>Se acepta si el cajero registra las 3 ventas sin ayuda, cada una en máximo 3 pasos (RNF01), el tiempo promedio es menor que con el proceso actual, el total coincide con lo que cobraría normalmente y entiende a la primera el aviso de producto no disponible. Si falla cualquiera de estos puntos, se replantea el flujo con el cajero antes de seguir.</w:t>
+              <w:t>Se acepta si el cajero registra las 3 ventas sin ayuda, cada una en máximo 3 pasos (RNF01 pide de 2 a 3), el tiempo promedio es menor que con el proceso actual, el total coincide con lo que cobraría normalmente y entiende a la primera el aviso de producto no disponible. Si falla cualquiera de estos puntos, se replantea el flujo con el cajero antes de seguir.</w:t>
             </w:r>
           </w:p>
         </w:tc>
@@ -18106,8 +18338,7 @@
           <w:lang w:val="es-EC"/>
         </w:rPr>
       </w:pPr>
-      <w:bookmarkStart w:id="14" w:name="_Toc240009008"/>
-      <w:bookmarkStart w:id="15" w:name="_Toc241502994"/>
+      <w:bookmarkStart w:id="7" w:name="_Toc240009008"/>
       <w:r>
         <w:rPr>
           <w:sz w:val="22"/>
@@ -18115,8 +18346,7 @@
         </w:rPr>
         <w:t>8. Hilo de trazabilidad</w:t>
       </w:r>
-      <w:bookmarkEnd w:id="14"/>
-      <w:bookmarkEnd w:id="15"/>
+      <w:bookmarkEnd w:id="7"/>
     </w:p>
     <w:p>
       <w:pPr>
@@ -18767,7 +18997,7 @@
                 <w:sz w:val="15"/>
                 <w:szCs w:val="15"/>
               </w:rPr>
-              <w:t xml:space="preserve"> (DEF-03 en diagrama)</w:t>
+              <w:t xml:space="preserve"> (DEF-03 corregido)</w:t>
             </w:r>
           </w:p>
         </w:tc>
@@ -18796,7 +19026,7 @@
                 <w:sz w:val="15"/>
                 <w:szCs w:val="15"/>
               </w:rPr>
-              <w:t>Figura 3</w:t>
+              <w:t>Figuras 3 y 6</w:t>
             </w:r>
           </w:p>
         </w:tc>
@@ -19121,7 +19351,7 @@
                 <w:sz w:val="15"/>
                 <w:szCs w:val="15"/>
               </w:rPr>
-              <w:t xml:space="preserve"> 6 pendiente (DEF-04)</w:t>
+              <w:t xml:space="preserve"> 7 corregido (DEF-04)</w:t>
             </w:r>
           </w:p>
         </w:tc>
@@ -19150,7 +19380,7 @@
                 <w:sz w:val="15"/>
                 <w:szCs w:val="15"/>
               </w:rPr>
-              <w:t>Figura 3</w:t>
+              <w:t>Figuras 3 y 7</w:t>
             </w:r>
           </w:p>
         </w:tc>
@@ -19523,6 +19753,7 @@
                 <w:sz w:val="15"/>
                 <w:szCs w:val="15"/>
               </w:rPr>
+              <w:lastRenderedPageBreak/>
               <w:t>RF01</w:t>
             </w:r>
           </w:p>
@@ -19720,7 +19951,7 @@
                 <w:sz w:val="15"/>
                 <w:szCs w:val="15"/>
               </w:rPr>
-              <w:t>E2 pendiente en SEQ01 (DEF-04)</w:t>
+              <w:t>E2 agregado en SEQ01 v2 (DEF-04)</w:t>
             </w:r>
           </w:p>
         </w:tc>
@@ -19749,7 +19980,7 @@
                 <w:sz w:val="15"/>
                 <w:szCs w:val="15"/>
               </w:rPr>
-              <w:t>Figura 3</w:t>
+              <w:t>Figuras 3 y 7</w:t>
             </w:r>
           </w:p>
         </w:tc>
@@ -19813,7 +20044,6 @@
                 <w:sz w:val="15"/>
                 <w:szCs w:val="15"/>
               </w:rPr>
-              <w:lastRenderedPageBreak/>
               <w:t>RF01</w:t>
             </w:r>
           </w:p>
@@ -20390,7 +20620,7 @@
                 <w:sz w:val="15"/>
                 <w:szCs w:val="15"/>
               </w:rPr>
-              <w:t xml:space="preserve"> como enumeración (DEF-03 en diagrama)</w:t>
+              <w:t xml:space="preserve"> como enumeración (DEF-03 corregido)</w:t>
             </w:r>
           </w:p>
         </w:tc>
@@ -20419,7 +20649,7 @@
                 <w:sz w:val="15"/>
                 <w:szCs w:val="15"/>
               </w:rPr>
-              <w:t>Figura 3</w:t>
+              <w:t>Figuras 3 y 6</w:t>
             </w:r>
           </w:p>
         </w:tc>
@@ -21062,8 +21292,7 @@
           <w:lang w:val="es-EC"/>
         </w:rPr>
       </w:pPr>
-      <w:bookmarkStart w:id="16" w:name="_Toc240009009"/>
-      <w:bookmarkStart w:id="17" w:name="_Toc241502995"/>
+      <w:bookmarkStart w:id="8" w:name="_Toc240009009"/>
       <w:r>
         <w:rPr>
           <w:sz w:val="22"/>
@@ -21071,8 +21300,7 @@
         </w:rPr>
         <w:t>9. Conclusión individual</w:t>
       </w:r>
-      <w:bookmarkEnd w:id="16"/>
-      <w:bookmarkEnd w:id="17"/>
+      <w:bookmarkEnd w:id="8"/>
     </w:p>
     <w:p>
       <w:pPr>
@@ -21130,16 +21358,14 @@
           <w:sz w:val="22"/>
         </w:rPr>
       </w:pPr>
-      <w:bookmarkStart w:id="18" w:name="_Toc240009010"/>
-      <w:bookmarkStart w:id="19" w:name="_Toc241502996"/>
+      <w:bookmarkStart w:id="9" w:name="_Toc240009010"/>
       <w:r>
         <w:rPr>
           <w:sz w:val="22"/>
         </w:rPr>
         <w:t>10. Referencias</w:t>
       </w:r>
-      <w:bookmarkEnd w:id="18"/>
-      <w:bookmarkEnd w:id="19"/>
+      <w:bookmarkEnd w:id="9"/>
     </w:p>
     <w:p>
       <w:pPr>
@@ -21260,17 +21486,16 @@
           <w:lang w:val="es-EC"/>
         </w:rPr>
       </w:pPr>
-      <w:bookmarkStart w:id="20" w:name="_Toc240009011"/>
-      <w:bookmarkStart w:id="21" w:name="_Toc241502997"/>
+      <w:bookmarkStart w:id="10" w:name="_Toc240009011"/>
       <w:r>
         <w:rPr>
           <w:sz w:val="22"/>
           <w:lang w:val="es-EC"/>
         </w:rPr>
+        <w:lastRenderedPageBreak/>
         <w:t>11. Declaración de uso de inteligencia artificial</w:t>
       </w:r>
-      <w:bookmarkEnd w:id="20"/>
-      <w:bookmarkEnd w:id="21"/>
+      <w:bookmarkEnd w:id="10"/>
     </w:p>
     <w:p>
       <w:pPr>
@@ -21344,7 +21569,6 @@
                 <w:bCs/>
                 <w:color w:val="FFFFFF"/>
               </w:rPr>
-              <w:lastRenderedPageBreak/>
               <w:t>Campo</w:t>
             </w:r>
           </w:p>
@@ -21688,8 +21912,7 @@
           <w:lang w:val="es-EC"/>
         </w:rPr>
       </w:pPr>
-      <w:bookmarkStart w:id="22" w:name="_Toc240009012"/>
-      <w:bookmarkStart w:id="23" w:name="_Toc241502998"/>
+      <w:bookmarkStart w:id="11" w:name="_Toc240009012"/>
       <w:r>
         <w:rPr>
           <w:sz w:val="22"/>
@@ -21697,8 +21920,7 @@
         </w:rPr>
         <w:t>12. Artefactos en el repositorio</w:t>
       </w:r>
-      <w:bookmarkEnd w:id="22"/>
-      <w:bookmarkEnd w:id="23"/>
+      <w:bookmarkEnd w:id="11"/>
     </w:p>
     <w:p>
       <w:pPr>
@@ -22373,7 +22595,7 @@
                 <w:color w:val="222222"/>
               </w:rPr>
               <w:lastRenderedPageBreak/>
-              <w:t>Modelos UML</w:t>
+              <w:t>Modelos UML (antes)</w:t>
             </w:r>
           </w:p>
         </w:tc>
@@ -22427,7 +22649,110 @@
               <w:rPr>
                 <w:color w:val="222222"/>
               </w:rPr>
-              <w:t>Diagrama de clases y SEQ01 usados en la auditoría</w:t>
+              <w:t>Diagrama de clases y SEQ01 del Ae5 usados en la auditoría</w:t>
+            </w:r>
+          </w:p>
+        </w:tc>
+      </w:tr>
+      <w:tr>
+        <w:trPr>
+          <w:cantSplit/>
+          <w:jc w:val="center"/>
+        </w:trPr>
+        <w:tc>
+          <w:tcPr>
+            <w:tcW w:w="2600" w:type="dxa"/>
+            <w:tcBorders>
+              <w:top w:val="single" w:sz="5" w:space="0" w:color="D0D0D0"/>
+              <w:left w:val="single" w:sz="5" w:space="0" w:color="D0D0D0"/>
+              <w:bottom w:val="single" w:sz="5" w:space="0" w:color="D0D0D0"/>
+              <w:right w:val="single" w:sz="5" w:space="0" w:color="D0D0D0"/>
+            </w:tcBorders>
+            <w:shd w:val="clear" w:color="auto" w:fill="FFFFFF"/>
+            <w:tcMar>
+              <w:top w:w="70" w:type="dxa"/>
+              <w:left w:w="80" w:type="dxa"/>
+              <w:bottom w:w="70" w:type="dxa"/>
+              <w:right w:w="80" w:type="dxa"/>
+            </w:tcMar>
+            <w:vAlign w:val="center"/>
+          </w:tcPr>
+          <w:p>
+            <w:r>
+              <w:rPr>
+                <w:color w:val="222222"/>
+              </w:rPr>
+              <w:t>Modelos UML (después)</w:t>
+            </w:r>
+          </w:p>
+        </w:tc>
+        <w:tc>
+          <w:tcPr>
+            <w:tcW w:w="3600" w:type="dxa"/>
+            <w:tcBorders>
+              <w:top w:val="single" w:sz="5" w:space="0" w:color="D0D0D0"/>
+              <w:left w:val="single" w:sz="5" w:space="0" w:color="D0D0D0"/>
+              <w:bottom w:val="single" w:sz="5" w:space="0" w:color="D0D0D0"/>
+              <w:right w:val="single" w:sz="5" w:space="0" w:color="D0D0D0"/>
+            </w:tcBorders>
+            <w:shd w:val="clear" w:color="auto" w:fill="FFFFFF"/>
+            <w:tcMar>
+              <w:top w:w="70" w:type="dxa"/>
+              <w:left w:w="80" w:type="dxa"/>
+              <w:bottom w:w="70" w:type="dxa"/>
+              <w:right w:w="80" w:type="dxa"/>
+            </w:tcMar>
+            <w:vAlign w:val="center"/>
+          </w:tcPr>
+          <w:p>
+            <w:r>
+              <w:rPr>
+                <w:color w:val="222222"/>
+              </w:rPr>
+              <w:t>Ae6/modelos/diagrama-clases-v2.drawio</w:t>
+            </w:r>
+          </w:p>
+          <w:p>
+            <w:r>
+              <w:rPr>
+                <w:color w:val="222222"/>
+              </w:rPr>
+              <w:t>Ae6/modelos/SEQ01-registrar-venta-v2.drawio</w:t>
+            </w:r>
+          </w:p>
+          <w:p>
+            <w:r>
+              <w:rPr>
+                <w:color w:val="222222"/>
+              </w:rPr>
+              <w:t>(con sus PNG)</w:t>
+            </w:r>
+          </w:p>
+        </w:tc>
+        <w:tc>
+          <w:tcPr>
+            <w:tcW w:w="2829" w:type="dxa"/>
+            <w:tcBorders>
+              <w:top w:val="single" w:sz="5" w:space="0" w:color="D0D0D0"/>
+              <w:left w:val="single" w:sz="5" w:space="0" w:color="D0D0D0"/>
+              <w:bottom w:val="single" w:sz="5" w:space="0" w:color="D0D0D0"/>
+              <w:right w:val="single" w:sz="5" w:space="0" w:color="D0D0D0"/>
+            </w:tcBorders>
+            <w:shd w:val="clear" w:color="auto" w:fill="FFFFFF"/>
+            <w:tcMar>
+              <w:top w:w="70" w:type="dxa"/>
+              <w:left w:w="80" w:type="dxa"/>
+              <w:bottom w:w="70" w:type="dxa"/>
+              <w:right w:w="80" w:type="dxa"/>
+            </w:tcMar>
+            <w:vAlign w:val="center"/>
+          </w:tcPr>
+          <w:p>
+            <w:r>
+              <w:rPr>
+                <w:color w:val="222222"/>
+              </w:rPr>
+              <w:t>Diagramas corregidos por DEF-03 y DEF-04</w:t>
             </w:r>
           </w:p>
         </w:tc>
@@ -22447,8 +22772,7 @@
           <w:lang w:val="es-EC"/>
         </w:rPr>
       </w:pPr>
-      <w:bookmarkStart w:id="24" w:name="_Toc240009013"/>
-      <w:bookmarkStart w:id="25" w:name="_Toc241502999"/>
+      <w:bookmarkStart w:id="12" w:name="_Toc240009013"/>
       <w:r>
         <w:rPr>
           <w:sz w:val="22"/>
@@ -22472,8 +22796,7 @@
         </w:rPr>
         <w:t xml:space="preserve"> antes de entregar</w:t>
       </w:r>
-      <w:bookmarkEnd w:id="24"/>
-      <w:bookmarkEnd w:id="25"/>
+      <w:bookmarkEnd w:id="12"/>
     </w:p>
     <w:p>
       <w:pPr>
@@ -22556,11 +22879,22 @@
         <w:t>[X] He declarado el uso de IA cuando corresponde.</w:t>
       </w:r>
     </w:p>
-    <w:p/>
+    <w:p>
+      <w:pPr>
+        <w:rPr>
+          <w:rFonts w:asciiTheme="majorHAnsi" w:hAnsiTheme="majorHAnsi" w:cstheme="majorHAnsi"/>
+          <w:b/>
+          <w:bCs/>
+          <w:color w:val="791632"/>
+          <w:sz w:val="24"/>
+          <w:szCs w:val="24"/>
+        </w:rPr>
+      </w:pPr>
+    </w:p>
     <w:sectPr>
-      <w:headerReference w:type="default" r:id="rId20"/>
-      <w:footerReference w:type="default" r:id="rId21"/>
-      <w:headerReference w:type="first" r:id="rId22"/>
+      <w:headerReference w:type="default" r:id="rId22"/>
+      <w:footerReference w:type="default" r:id="rId23"/>
+      <w:headerReference w:type="first" r:id="rId24"/>
       <w:pgSz w:w="11909" w:h="16834"/>
       <w:pgMar w:top="1440" w:right="1440" w:bottom="568" w:left="1440" w:header="720" w:footer="720" w:gutter="0"/>
       <w:pgNumType w:start="1"/>
@@ -28719,28 +29053,28 @@
 </file>
 
 <file path=customXml/item1.xml><?xml version="1.0" encoding="utf-8"?>
+<b:Sources xmlns:b="http://schemas.openxmlformats.org/officeDocument/2006/bibliography" xmlns="http://schemas.openxmlformats.org/officeDocument/2006/bibliography" SelectedStyle="\APASixthEditionOfficeOnline.xsl" StyleName="APA" Version="6"/>
+</file>
+
+<file path=customXml/item2.xml><?xml version="1.0" encoding="utf-8"?>
 <go:gDocsCustomXmlDataStorage xmlns:go="http://customooxmlschemas.google.com/" xmlns:r="http://schemas.openxmlformats.org/officeDocument/2006/relationships" uri="GoogleDocsCustomDataVersion2">
   <go:docsCustomData xmlns:go="http://customooxmlschemas.google.com/" roundtripDataSignature="AMtx7mg0yBGk/G1jIb7TI+n2nw7pFPAQfg==">CgMxLjA4AHIhMUktMWx2MkhWTFNlQVRpYjZQLWtNQTFOc0xUa0Q3RzZl</go:docsCustomData>
 </go:gDocsCustomXmlDataStorage>
 </file>
 
-<file path=customXml/item2.xml><?xml version="1.0" encoding="utf-8"?>
-<b:Sources xmlns:b="http://schemas.openxmlformats.org/officeDocument/2006/bibliography" xmlns="http://schemas.openxmlformats.org/officeDocument/2006/bibliography" SelectedStyle="\APASixthEditionOfficeOnline.xsl" StyleName="APA" Version="6"/>
+<file path=customXml/itemProps1.xml><?xml version="1.0" encoding="utf-8"?>
+<ds:datastoreItem xmlns:ds="http://schemas.openxmlformats.org/officeDocument/2006/customXml" ds:itemID="{C84DD27D-AA31-49E7-9044-2FD3CD563DCF}">
+  <ds:schemaRefs>
+    <ds:schemaRef ds:uri="http://schemas.openxmlformats.org/officeDocument/2006/bibliography"/>
+  </ds:schemaRefs>
+</ds:datastoreItem>
 </file>
 
-<file path=customXml/itemProps1.xml><?xml version="1.0" encoding="utf-8"?>
+<file path=customXml/itemProps2.xml><?xml version="1.0" encoding="utf-8"?>
 <ds:datastoreItem xmlns:ds="http://schemas.openxmlformats.org/officeDocument/2006/customXml" ds:itemID="{11111111-1234-1234-1234-123412341234}">
   <ds:schemaRefs>
     <ds:schemaRef ds:uri="http://customooxmlschemas.google.com/"/>
     <ds:schemaRef ds:uri="http://schemas.openxmlformats.org/officeDocument/2006/relationships"/>
   </ds:schemaRefs>
 </ds:datastoreItem>
-</file>
-
-<file path=customXml/itemProps2.xml><?xml version="1.0" encoding="utf-8"?>
-<ds:datastoreItem xmlns:ds="http://schemas.openxmlformats.org/officeDocument/2006/customXml" ds:itemID="{C84DD27D-AA31-49E7-9044-2FD3CD563DCF}">
-  <ds:schemaRefs>
-    <ds:schemaRef ds:uri="http://schemas.openxmlformats.org/officeDocument/2006/bibliography"/>
-  </ds:schemaRefs>
-</ds:datastoreItem>
 </file>
</xml_diff>